<commit_message>
docs: update academic project report for Generative Artificial Intelligence course
</commit_message>
<xml_diff>
--- a/CardioDiff_Project_Report.docx
+++ b/CardioDiff_Project_Report.docx
@@ -69,14 +69,14 @@
       </w:pPr>
       <w:r>
         <w:rPr>
-          <w:b w:val="0"/>
-          <w:i/>
-          <w:color w:val="2D3748"/>
-          <w:sz w:val="24"/>
+          <w:b/>
+          <w:i w:val="0"/>
+          <w:color w:val="2B6CB0"/>
+          <w:sz w:val="26"/>
         </w:rPr>
         <w:t>A Project Report Submitted in Partial Fulfillment of the Requirements for the Course</w:t>
         <w:br/>
-        <w:t>SOFT COMPUTING</w:t>
+        <w:t>GENERATIVE ARTIFICIAL INTELLIGENCE</w:t>
       </w:r>
     </w:p>
     <w:p>
@@ -612,7 +612,7 @@
               <w:rPr>
                 <w:color w:val="2D3748"/>
               </w:rPr>
-              <w:t xml:space="preserve">    3.3 Relevance in Soft Computing and Biomedical AI</w:t>
+              <w:t xml:space="preserve">    3.3 Relevance in Generative AI and Biomedical Systems</w:t>
             </w:r>
           </w:p>
         </w:tc>
@@ -859,7 +859,7 @@
               <w:rPr>
                 <w:color w:val="2D3748"/>
               </w:rPr>
-              <w:t xml:space="preserve">    5.2 Generative Models: GANs vs. VAEs</w:t>
+              <w:t xml:space="preserve">    5.2 Deep Generative Models: GANs, VAEs, and Normalizing Flows</w:t>
             </w:r>
           </w:p>
         </w:tc>
@@ -894,7 +894,7 @@
               <w:rPr>
                 <w:color w:val="2D3748"/>
               </w:rPr>
-              <w:t xml:space="preserve">    5.3 Limitations and Gaps in Existing Approaches</w:t>
+              <w:t xml:space="preserve">    5.3 Limitations and Gaps in Existing Generative Paradigms</w:t>
             </w:r>
           </w:p>
         </w:tc>
@@ -1070,7 +1070,7 @@
               <w:rPr>
                 <w:color w:val="2D3748"/>
               </w:rPr>
-              <w:t xml:space="preserve">    6.3 Conditional 1D DDPM Architecture</w:t>
+              <w:t xml:space="preserve">    6.3 Conditional 1D DDPM Generative Architecture</w:t>
             </w:r>
           </w:p>
         </w:tc>
@@ -1106,7 +1106,7 @@
                 <w:b/>
                 <w:color w:val="1A365D"/>
               </w:rPr>
-              <w:t>7. Soft Computing Technique: Denoising Diffusion Models</w:t>
+              <w:t>7. Generative AI Technique: Denoising Diffusion Models (DDPM)</w:t>
             </w:r>
           </w:p>
         </w:tc>
@@ -1141,7 +1141,7 @@
               <w:rPr>
                 <w:color w:val="2D3748"/>
               </w:rPr>
-              <w:t xml:space="preserve">    7.1 Fundamental Concept of Continuous Diffusion</w:t>
+              <w:t xml:space="preserve">    7.1 Fundamental Concept of Score-Based Diffusion Models</w:t>
             </w:r>
           </w:p>
         </w:tc>
@@ -1176,7 +1176,7 @@
               <w:rPr>
                 <w:color w:val="2D3748"/>
               </w:rPr>
-              <w:t xml:space="preserve">    7.2 Forward (Diffusion) and Reverse (Denoising) Processes</w:t>
+              <w:t xml:space="preserve">    7.2 Forward Diffusion and Reverse Denoising Markov Chains</w:t>
             </w:r>
           </w:p>
         </w:tc>
@@ -1211,7 +1211,7 @@
               <w:rPr>
                 <w:color w:val="2D3748"/>
               </w:rPr>
-              <w:t xml:space="preserve">    7.3 Conditioning &amp; Sinusoidal Temporal Embeddings</w:t>
+              <w:t xml:space="preserve">    7.3 Class Conditioning &amp; Sinusoidal Temporal Embeddings</w:t>
             </w:r>
           </w:p>
         </w:tc>
@@ -1669,7 +1669,7 @@
               <w:rPr>
                 <w:color w:val="2D3748"/>
               </w:rPr>
-              <w:t xml:space="preserve">    10.2 Mathematical Formulations of Evaluation Metrics</w:t>
+              <w:t xml:space="preserve">    10.2 Mathematical Formulations of Evaluation Metrics (1D-FID, Diversity)</w:t>
             </w:r>
           </w:p>
         </w:tc>
@@ -1986,7 +1986,7 @@
               <w:rPr>
                 <w:color w:val="2D3748"/>
               </w:rPr>
-              <w:t xml:space="preserve">    12.3 Clinical Impact &amp; Utility</w:t>
+              <w:t xml:space="preserve">    12.3 Clinical Impact &amp; Data-Centric AI</w:t>
             </w:r>
           </w:p>
         </w:tc>
@@ -2130,7 +2130,7 @@
                 <w:b/>
                 <w:color w:val="1A365D"/>
               </w:rPr>
-              <w:t>16. Appendix: Core Code Snippets</w:t>
+              <w:t>16. Appendix: Core Code Implementations</w:t>
             </w:r>
           </w:p>
         </w:tc>
@@ -2182,7 +2182,7 @@
           <w:b w:val="0"/>
           <w:i w:val="0"/>
         </w:rPr>
-        <w:t>Cardiovascular diseases (CVDs) remain the leading cause of global mortality, demanding automated, real-time electrocardiogram (ECG) arrhythmia classification for patient monitoring. However, real-world clinical bio-signal datasets exhibit severe class imbalance, where normal heartbeats overpower critical, life-threatening arrhythmias (such as Premature Ventricular Contractions, Supraventricular Ectopic beats, and Ventricular Fusion beats). Machine learning classifiers trained on such unmitigated distributions exhibit drastic bias towards the majority class, sacrificing minority diagnostic recall.</w:t>
+        <w:t>Cardiovascular diseases (CVDs) remain the leading cause of global mortality, demanding automated, real-time electrocardiogram (ECG) arrhythmia classification for patient monitoring. However, clinical bio-signal datasets exhibit severe class imbalance, where normal heartbeats overpower critical, life-threatening arrhythmias (such as Premature Ventricular Contractions, Supraventricular Ectopic beats, and Ventricular Fusion beats). Supervised deep learning models trained on such skewed distributions suffer from severe majority bias, sacrificing diagnostic sensitivity on rare, high-risk conditions.</w:t>
       </w:r>
     </w:p>
     <w:p>
@@ -2195,7 +2195,7 @@
           <w:b w:val="0"/>
           <w:i w:val="0"/>
         </w:rPr>
-        <w:t>To overcome this fundamental challenge, this project develops CardioDiff, a soft computing framework combining Conditional 1D Denoising Diffusion Probabilistic Models (DDPM) with deep 1D Convolutional Neural Networks (1D-CNN) for physiological heartbeat synthesis and augmented classification. CardioDiff models the non-linear, stochastic data distribution of 125 Hz ECG waveforms (187 points) across a parameterized Markov chain, learning the underlying manifold of underrepresented cardiac conditions.</w:t>
+        <w:t>To overcome this fundamental limitation, this project introduces CardioDiff, a Generative Artificial Intelligence (GenAI) framework utilizing Conditional 1D Denoising Diffusion Probabilistic Models (DDPM) coupled with deep 1D Convolutional Neural Networks (1D-CNN) for high-fidelity physiological heartbeat synthesis and generative data augmentation. CardioDiff models the continuous, non-linear probability density function p(x|y) of 125 Hz ECG waveforms (187 signal points) via a parameterized reverse-time Markov process, accurately learning the electrophysiological manifold of underrepresented cardiac conditions without mode collapse.</w:t>
       </w:r>
     </w:p>
     <w:p>
@@ -2208,7 +2208,7 @@
           <w:b w:val="0"/>
           <w:i w:val="0"/>
         </w:rPr>
-        <w:t>Trained and evaluated on 109,446 real clinical heartbeats from the benchmark PhysioNet / Kaggle MIT-BIH Arrhythmia Database (87,554 training beats, 21,892 held-out test beats), CardioDiff achieves an overall accuracy of 96.90%, a Macro-F1 score of 0.8210 (a +16.56% absolute improvement over the baseline 0.6554), and minority diagnostic recall of 0.7876 (a +29.78% increase over the baseline 0.4898). The synthesized waveforms attain a 1D Fréchet Inception Distance (1D-FID) of 40.0401 and an optimal Diversity Ratio of 1.0253, indicating high morphological fidelity without mode collapse. The end-to-end framework is containerized and deployed live on Streamlit Cloud (https://cardiodiff.streamlit.app/).</w:t>
+        <w:t>Trained and evaluated on 109,446 real clinical heartbeats from the benchmark PhysioNet / Kaggle MIT-BIH Arrhythmia Database (87,554 training beats, 21,892 held-out test beats), CardioDiff achieves an overall accuracy of 96.90%, a Macro-F1 score of 0.8210 (a +16.56% absolute improvement over the baseline 0.6554), and minority diagnostic recall of 0.7876 (a +29.78% increase over the baseline 0.4898). Crucially, the rarest condition (Class 3: Fusion Beat, &lt;0.8% of data) saw diagnostic recall rise from 21.60% to 77.16% (+55.56%). The synthesized waveforms achieve a 1D Fréchet Inception Distance (1D-FID) of 40.0401 and an optimal Diversity Ratio of 1.0253, confirming high morphological realism and broad manifold coverage. The framework is deployed live as an interactive web platform on Streamlit Cloud (https://cardiodiff.streamlit.app/).</w:t>
       </w:r>
     </w:p>
     <w:tbl>
@@ -2248,7 +2248,7 @@
               <w:rPr>
                 <w:sz w:val="21"/>
               </w:rPr>
-              <w:t>Keywords: Soft Computing, Denoising Diffusion Probabilistic Models (DDPM), Electrocardiogram (ECG), 1D-CNN, Class Imbalance, Arrhythmia Classification, MIT-BIH Database, 1D-FID, Streamlit Cloud.</w:t>
+              <w:t>Keywords: Generative Artificial Intelligence (GenAI), Denoising Diffusion Probabilistic Models (DDPM), Electrocardiogram (ECG) Synthesis, 1D-CNN, Class Imbalance, 1D Fréchet Inception Distance (1D-FID), Data-Centric AI, Streamlit Cloud.</w:t>
             </w:r>
           </w:p>
         </w:tc>
@@ -2302,7 +2302,13 @@
           <w:b w:val="0"/>
           <w:i w:val="0"/>
         </w:rPr>
-        <w:t>The electrocardiogram (ECG) represents the non-invasive recording of electrical potentials generated by cardiac muscle depolarization and repolarization throughout each cardiac cycle. A normal sinus heartbeat displays characteristic physiological deflections: the P wave (atrial depolarization), the QRS complex (ventricular depolarization), and the T wave (ventricular repolarization). Variations in the duration, amplitude, or morphological structure of these intervals serve as diagnostic indicators of cardiac arrhythmias.</w:t>
+        <w:t xml:space="preserve">The electrocardiogram (ECG) captures the spatial-temporal propagation of electrical cardiac action potentials through the myocardial conduction system. A canonical heartbeat cycle exhibits three fundamental morphological deflections: </w:t>
+        <w:br/>
+        <w:t>• The P wave: Atrial depolarization.</w:t>
+        <w:br/>
+        <w:t>• The QRS complex: Rapid ventricular depolarization, reflecting ventricular contraction.</w:t>
+        <w:br/>
+        <w:t>• The T wave: Ventricular repolarization.</w:t>
       </w:r>
     </w:p>
     <w:p>
@@ -2315,7 +2321,7 @@
           <w:b w:val="0"/>
           <w:i w:val="0"/>
         </w:rPr>
-        <w:t>While automated machine learning algorithms have achieved impressive performance in controlled benchmark settings, real-world deployment is severely obstructed by extreme epidemiological class imbalance. Out of routine Holter recordings or ambulatory ECG feeds, over 80% to 90% of recorded heartbeats belong to normal rhythm, whereas malignant conditions—such as Ventricular Ectopic Beats (PVCs) or Fusion Beats—manifest infrequently.</w:t>
+        <w:t>Deviations in wave morphology, duration, amplitude, or inter-beat intervals indicate underlying electrophysiological abnormalities known as cardiac arrhythmias. While deep learning architectures (such as 1D-CNNs and Transformers) achieve strong performance under synthetic or artificially balanced test conditions, clinical deployment in ambulatory telemetry and emergency care faces a critical bottleneck: epidemiological class imbalance. In standard clinical datasets, normal sinus rhythms constitute over 80% to 90% of recordings, while lethal ventricular and fusion arrhythmias occur rarely.</w:t>
       </w:r>
     </w:p>
     <w:p>
@@ -2342,7 +2348,7 @@
           <w:b w:val="0"/>
           <w:i w:val="0"/>
         </w:rPr>
-        <w:t>When standard connectionist models (e.g., deep neural networks) minimize empirical risk over severely skewed training sets, the loss gradient is dominated by normal heartbeats. Consequently, the network achieves an artificially high global accuracy (&gt;94%) simply by predicting the majority class, while exhibiting disastrous false-negative rates on critical arrhythmias. In a medical diagnostic context, missing a malignant ventricular event can lead to undetected ventricular fibrillation and cardiac arrest.</w:t>
+        <w:t>When modern neural classifiers minimize empirical risk on severely skewed training sets, the optimization trajectory is heavily dominated by majority normal heartbeats. Consequently, models achieve superficially high accuracy (&gt;94%) by routinely predicting normal rhythm, while completely failing to detect rare, life-threatening arrhythmias. In acute clinical scenarios, false negatives on ventricular ectopic contractions or fusion beats can lead to undetected sustained ventricular tachycardia and sudden cardiac death.</w:t>
       </w:r>
     </w:p>
     <w:p>
@@ -2355,7 +2361,45 @@
           <w:b w:val="0"/>
           <w:i w:val="0"/>
         </w:rPr>
-        <w:t>Traditional statistical oversampling techniques (such as Random Oversampling) merely duplicate identical signals, leading to acute overfitting on specific noise patterns. Classical heuristic interpolation methods (such as SMOTE) create linear blends between distinct cardiac beats that violate biophysical laws, yielding non-physiological waveforms with corrupted ST segments and distorted QRS peaks. Therefore, there is a compelling need for advanced generative soft computing paradigms that model the continuous, high-dimensional probability distribution of biological time-series data.</w:t>
+        <w:t xml:space="preserve">Traditional mitigation methods fail in medical time series: </w:t>
+      </w:r>
+    </w:p>
+    <w:p>
+      <w:pPr>
+        <w:pStyle w:val="ListBullet"/>
+        <w:spacing w:after="80" w:line="276" w:lineRule="auto"/>
+      </w:pPr>
+      <w:r>
+        <w:rPr>
+          <w:b/>
+          <w:color w:val="2D3748"/>
+        </w:rPr>
+        <w:t xml:space="preserve">Random Oversampling (ROS): </w:t>
+      </w:r>
+      <w:r>
+        <w:rPr>
+          <w:color w:val="2D3748"/>
+        </w:rPr>
+        <w:t>Duplicates minority samples verbatim, causing the model to overfit on noise artifacts and patient-specific baseline wander.</w:t>
+      </w:r>
+    </w:p>
+    <w:p>
+      <w:pPr>
+        <w:pStyle w:val="ListBullet"/>
+        <w:spacing w:after="80" w:line="276" w:lineRule="auto"/>
+      </w:pPr>
+      <w:r>
+        <w:rPr>
+          <w:b/>
+          <w:color w:val="2D3748"/>
+        </w:rPr>
+        <w:t xml:space="preserve">SMOTE &amp; Heuristic Interpolation: </w:t>
+      </w:r>
+      <w:r>
+        <w:rPr>
+          <w:color w:val="2D3748"/>
+        </w:rPr>
+        <w:t>Linearly blends nearest-neighbor waveforms. Because cardiac waveforms represent non-linear solutions to differential cardiac electrodynamics, linear interpolation generates physically impossible signals with distorted ST segments, blunted QRS peaks, and unnatural repolarization curves.</w:t>
       </w:r>
     </w:p>
     <w:p>
@@ -2369,7 +2413,7 @@
           <w:color w:val="2B6CB0"/>
           <w:sz w:val="28"/>
         </w:rPr>
-        <w:t>3.3 Relevance in Soft Computing and Biomedical AI</w:t>
+        <w:t>3.3 Relevance in Generative AI and Biomedical Systems</w:t>
       </w:r>
     </w:p>
     <w:p>
@@ -2382,7 +2426,64 @@
           <w:b w:val="0"/>
           <w:i w:val="0"/>
         </w:rPr>
-        <w:t>Soft computing addresses complex, non-linear, uncertain, and stochastic real-world problems through connectionist architectures, probabilistic reasoning, and evolutionary/generative learning. Denoising Diffusion Probabilistic Models (DDPM) represent a premier probabilistic soft computing paradigm. Rooted in non-equilibrium thermodynamics and stochastic calculus, diffusion models reformulate generative modeling as learning to reverse a gradual physical diffusion process that injects Gaussian uncertainty into signals. Coupled with 1D Convolutional Neural Networks, this paradigm captures spatial-temporal bio-signal invariances and generates continuous, biologically valid synthetic samples.</w:t>
+        <w:t xml:space="preserve">Generative Artificial Intelligence (GenAI) has emerged as a transformative frontier in modern machine learning, moving beyond discriminative pattern matching to learn the underlying joint distribution p(x, y) of complex multimodal data. While GenAI has seen extraordinary success in 2D computer vision and natural language processing, its application to continuous, single-lead 1D biomedical time series presents unique challenges: </w:t>
+      </w:r>
+    </w:p>
+    <w:p>
+      <w:pPr>
+        <w:pStyle w:val="ListBullet"/>
+        <w:spacing w:after="80" w:line="276" w:lineRule="auto"/>
+      </w:pPr>
+      <w:r>
+        <w:rPr>
+          <w:b/>
+          <w:color w:val="2D3748"/>
+        </w:rPr>
+        <w:t xml:space="preserve">Electrophysiological Consistency: </w:t>
+      </w:r>
+      <w:r>
+        <w:rPr>
+          <w:color w:val="2D3748"/>
+        </w:rPr>
+        <w:t>Generated heartbeats must adhere to strict temporal sequences (P-QRS-T) without high-frequency phase discontinuities.</w:t>
+      </w:r>
+    </w:p>
+    <w:p>
+      <w:pPr>
+        <w:pStyle w:val="ListBullet"/>
+        <w:spacing w:after="80" w:line="276" w:lineRule="auto"/>
+      </w:pPr>
+      <w:r>
+        <w:rPr>
+          <w:b/>
+          <w:color w:val="2D3748"/>
+        </w:rPr>
+        <w:t xml:space="preserve">Mode Collapse Avoidance: </w:t>
+      </w:r>
+      <w:r>
+        <w:rPr>
+          <w:color w:val="2D3748"/>
+        </w:rPr>
+        <w:t>Generative models must capture the diverse intra-class morphological variations of arrhythmias across different patients.</w:t>
+      </w:r>
+    </w:p>
+    <w:p>
+      <w:pPr>
+        <w:pStyle w:val="ListBullet"/>
+        <w:spacing w:after="80" w:line="276" w:lineRule="auto"/>
+      </w:pPr>
+      <w:r>
+        <w:rPr>
+          <w:b/>
+          <w:color w:val="2D3748"/>
+        </w:rPr>
+        <w:t xml:space="preserve">Training Stability: </w:t>
+      </w:r>
+      <w:r>
+        <w:rPr>
+          <w:color w:val="2D3748"/>
+        </w:rPr>
+        <w:t>Unlike Generative Adversarial Networks (GANs), which suffer from minimax instability and vanishing gradients, Denoising Diffusion Probabilistic Models (DDPM) leverage score matching and non-equilibrium thermodynamics to provide stable, mode-covering generative modeling.</w:t>
       </w:r>
     </w:p>
     <w:p>
@@ -2409,7 +2510,7 @@
           <w:b w:val="0"/>
           <w:i w:val="0"/>
         </w:rPr>
-        <w:t xml:space="preserve">CardioDiff provides an end-to-end soft computing architecture addressing this medical AI challenge: </w:t>
+        <w:t xml:space="preserve">CardioDiff provides an end-to-end Generative AI pipeline addressing this challenge: </w:t>
       </w:r>
     </w:p>
     <w:p>
@@ -2422,13 +2523,13 @@
           <w:b/>
           <w:color w:val="2D3748"/>
         </w:rPr>
-        <w:t xml:space="preserve">Data Pipeline: </w:t>
+        <w:t xml:space="preserve">Bio-Signal Preprocessing Pipeline: </w:t>
       </w:r>
       <w:r>
         <w:rPr>
           <w:color w:val="2D3748"/>
         </w:rPr>
-        <w:t>Standardizes 187-point single-lead ECG recordings from the MIT-BIH dataset into normalized amplitudes in [0, 1].</w:t>
+        <w:t>Standardizes 187-sample ECG heartbeats sampled at 125 Hz from the MIT-BIH dataset into normalized amplitudes in [0, 1].</w:t>
       </w:r>
     </w:p>
     <w:p>
@@ -2441,13 +2542,13 @@
           <w:b/>
           <w:color w:val="2D3748"/>
         </w:rPr>
-        <w:t xml:space="preserve">Baseline 1D-CNN: </w:t>
+        <w:t xml:space="preserve">Baseline Discriminative Model: </w:t>
       </w:r>
       <w:r>
         <w:rPr>
           <w:color w:val="2D3748"/>
         </w:rPr>
-        <w:t>Trained directly on raw imbalanced distributions to benchmark majority bias and establish an empirical baseline.</w:t>
+        <w:t>Trains a 1D-CNN directly on the raw imbalanced dataset to establish an empirical performance benchmark.</w:t>
       </w:r>
     </w:p>
     <w:p>
@@ -2460,13 +2561,13 @@
           <w:b/>
           <w:color w:val="2D3748"/>
         </w:rPr>
-        <w:t xml:space="preserve">Conditional 1D DDPM: </w:t>
+        <w:t xml:space="preserve">Class-Conditioned 1D DDPM Denoiser: </w:t>
       </w:r>
       <w:r>
         <w:rPr>
           <w:color w:val="2D3748"/>
         </w:rPr>
-        <w:t>Employs a specialized 1D U-Net backbone with skip connections, sinusoidal time-step embeddings, and learnable class conditioning vectors to model cardiac waveforms over T=40 diffusion steps.</w:t>
+        <w:t>Formulates continuous ECG generation via a 1D U-Net backbone with skip connections, sinusoidal temporal embeddings, and class conditioning projections across T=40 diffusion steps.</w:t>
       </w:r>
     </w:p>
     <w:p>
@@ -2479,13 +2580,13 @@
           <w:b/>
           <w:color w:val="2D3748"/>
         </w:rPr>
-        <w:t xml:space="preserve">Targeted Augmentation: </w:t>
+        <w:t xml:space="preserve">Physiological Generative Augmentation: </w:t>
       </w:r>
       <w:r>
         <w:rPr>
           <w:color w:val="2D3748"/>
         </w:rPr>
-        <w:t>Synthesizes high-fidelity minority heartbeats to balance the training distribution.</w:t>
+        <w:t>Generates novel synthetic heartbeats for minority arrhythmia classes (Supraventricular, Ventricular, Fusion, Paced).</w:t>
       </w:r>
     </w:p>
     <w:p>
@@ -2498,13 +2599,13 @@
           <w:b/>
           <w:color w:val="2D3748"/>
         </w:rPr>
-        <w:t xml:space="preserve">Augmented 1D-CNN: </w:t>
+        <w:t xml:space="preserve">Augmented 1D-CNN Classifier: </w:t>
       </w:r>
       <w:r>
         <w:rPr>
           <w:color w:val="2D3748"/>
         </w:rPr>
-        <w:t>Trained on the expanded dataset, demonstrating massive recoveries in Macro-F1 and minority recall.</w:t>
+        <w:t>Retrains the 1D-CNN on the diffusion-augmented dataset, demonstrating dramatic recoveries in minority sensitivity.</w:t>
       </w:r>
     </w:p>
     <w:p>
@@ -2517,13 +2618,13 @@
           <w:b/>
           <w:color w:val="2D3748"/>
         </w:rPr>
-        <w:t xml:space="preserve">Streamlit Cloud Platform: </w:t>
+        <w:t xml:space="preserve">Interactive Cloud Deployment: </w:t>
       </w:r>
       <w:r>
         <w:rPr>
           <w:color w:val="2D3748"/>
         </w:rPr>
-        <w:t>Deployed live at https://cardiodiff.streamlit.app/ for real-time waveform generation, diffusion inspection, and latent manifold exploration.</w:t>
+        <w:t>Containerized and deployed live on Streamlit Cloud (https://cardiodiff.streamlit.app/), enabling real-time waveform generation, step-by-step diffusion trajectory inspection, and latent space PCA exploration.</w:t>
       </w:r>
     </w:p>
     <w:p>
@@ -2571,15 +2672,15 @@
         </w:rPr>
         <w:t xml:space="preserve">Given a discrete 1D electrocardiogram signal x in R^187 representing a segmented cardiac cycle sampled at 125 Hz, and an associated clinical diagnosis y in {0, 1, 2, 3, 4} corresponding to the ANSI/AAMI EC57 standard: </w:t>
         <w:br/>
-        <w:t>• Class 0: Normal Sinus Rhythm (N)</w:t>
+        <w:t>• Class 0: Normal Sinus Rhythm (N) — Majority Class (82.8%)</w:t>
         <w:br/>
-        <w:t>• Class 1: Supraventricular Ectopic Beat (S)</w:t>
+        <w:t>• Class 1: Supraventricular Ectopic Beat (S) — 2.5%</w:t>
         <w:br/>
-        <w:t>• Class 2: Premature Ventricular Contraction (V)</w:t>
+        <w:t>• Class 2: Premature Ventricular Contraction (V) — 6.6%</w:t>
         <w:br/>
-        <w:t>• Class 3: Fusion of Ventricular and Normal Beat (F)</w:t>
+        <w:t>• Class 3: Fusion of Ventricular and Normal Beat (F) — 0.7% (Extreme Minority)</w:t>
         <w:br/>
-        <w:t>• Class 4: Unclassifiable / Paced Beat (Q)</w:t>
+        <w:t>• Class 4: Unclassifiable / Paced Beat (Q) — 7.4%</w:t>
       </w:r>
     </w:p>
     <w:p>
@@ -2592,7 +2693,7 @@
           <w:b w:val="0"/>
           <w:i w:val="0"/>
         </w:rPr>
-        <w:t>The dataset exhibits extreme disproportion (|C0| &gt;&gt; |C4| &gt; |C2| &gt;&gt; |C1| &gt;&gt; |C3|), where Fusion beats constitute less than 0.8% of the data. The practical problem is: How can a generative soft computing framework learn the true probability distribution p(x|y) of scarce cardiac arrhythmias to synthesize realistic, diverse, electrophysiologically sound heartbeats, thereby eliminating classification bias and dramatically elevating minority diagnostic recall without degrading overall accuracy?</w:t>
+        <w:t>The training dataset exhibits an extreme imbalance ratio of 1 : 113.1 between Normal and Fusion beats. The Generative AI Problem: How can a conditional deep generative model accurately learn the continuous probability distribution p(x|y) of rare cardiac arrhythmias to synthesize physiologically coherent, diverse heartbeats that expand classification decision boundaries and eliminate diagnostic bias without degrading specificity?</w:t>
       </w:r>
     </w:p>
     <w:p>
@@ -2619,13 +2720,13 @@
           <w:b/>
           <w:color w:val="2D3748"/>
         </w:rPr>
-        <w:t xml:space="preserve">Objective 1 (Architect 1D DDPM): </w:t>
+        <w:t xml:space="preserve">Objective 1 (Architect Conditional 1D DDPM): </w:t>
       </w:r>
       <w:r>
         <w:rPr>
           <w:color w:val="2D3748"/>
         </w:rPr>
-        <w:t>Design a 1D U-Net denoiser tailored for continuous single-lead time-series signals with temporal sinusoidal encodings and categorical class embedding projections.</w:t>
+        <w:t>Design a specialized 1D U-Net denoiser tailored for continuous single-lead time series with sinusoidal time-step embeddings and learnable class conditioning vectors.</w:t>
       </w:r>
     </w:p>
     <w:p>
@@ -2644,7 +2745,7 @@
         <w:rPr>
           <w:color w:val="2D3748"/>
         </w:rPr>
-        <w:t>Develop a hierarchical 3-block 1D-CNN classifier whose 64-dimensional penultimate bottleneck enables feature extraction, evaluation of 1D Fréchet Inception Distance (1D-FID), and manifold projection.</w:t>
+        <w:t>Develop a hierarchical 3-block 1D-CNN classifier whose 64-dimensional penultimate bottleneck enables feature extraction, evaluation of 1D Fréchet Inception Distance (1D-FID), and latent manifold projection.</w:t>
       </w:r>
     </w:p>
     <w:p>
@@ -2676,7 +2777,7 @@
           <w:b/>
           <w:color w:val="2D3748"/>
         </w:rPr>
-        <w:t xml:space="preserve">Objective 4 (Prevent Mode Collapse): </w:t>
+        <w:t xml:space="preserve">Objective 4 (Prevent Generative Mode Collapse): </w:t>
       </w:r>
       <w:r>
         <w:rPr>
@@ -2695,7 +2796,7 @@
           <w:b/>
           <w:color w:val="2D3748"/>
         </w:rPr>
-        <w:t xml:space="preserve">Objective 5 (Cloud Clinical Deployment): </w:t>
+        <w:t xml:space="preserve">Objective 5 (Deploy Clinical GenAI Platform): </w:t>
       </w:r>
       <w:r>
         <w:rPr>
@@ -2798,13 +2899,13 @@
           <w:b/>
           <w:color w:val="2D3748"/>
         </w:rPr>
-        <w:t xml:space="preserve">SMOTE (Synthetic Minority Over-sampling): </w:t>
+        <w:t xml:space="preserve">SMOTE: </w:t>
       </w:r>
       <w:r>
         <w:rPr>
           <w:color w:val="2D3748"/>
         </w:rPr>
-        <w:t>Interpolates linearly between nearest neighbors. In non-linear physiological time series, linear combinations of out-of-phase ECG beats produce flattened QRS peaks, artificial baseline wander, and non-physiological wave morphology.</w:t>
+        <w:t>Linearly interpolates nearest neighbors, creating non-physiological waveforms with corrupted ST segments and distorted QRS peaks.</w:t>
       </w:r>
     </w:p>
     <w:p>
@@ -2818,7 +2919,7 @@
           <w:color w:val="2B6CB0"/>
           <w:sz w:val="28"/>
         </w:rPr>
-        <w:t>5.2 Generative Models: GANs vs. VAEs</w:t>
+        <w:t>5.2 Deep Generative Models: GANs, VAEs, and Normalizing Flows</w:t>
       </w:r>
     </w:p>
     <w:p>
@@ -2831,7 +2932,7 @@
           <w:b w:val="0"/>
           <w:i w:val="0"/>
         </w:rPr>
-        <w:t xml:space="preserve">With the advent of deep generative models, researchers explored 1D-GANs (e.g., WaveGAN, BiWGAN) and 1D-VAEs for ECG synthesis: </w:t>
+        <w:t xml:space="preserve">With the emergence of deep generative modeling, researchers explored several GenAI paradigms for bio-signals: </w:t>
       </w:r>
     </w:p>
     <w:p>
@@ -2850,7 +2951,7 @@
         <w:rPr>
           <w:color w:val="2D3748"/>
         </w:rPr>
-        <w:t>Optimize an evidence lower bound (ELBO) using an explicit Gaussian prior. While computationally efficient, VAEs suffer from blurriness and over-smoothing in time-series signals due to the injective nature of the reconstruction loss, failing to preserve sharp QRS spikes.</w:t>
+        <w:t>Optimize an evidence lower bound (ELBO) using an explicit Gaussian prior. While computationally fast, VAEs suffer from blurriness and over-smoothing in time-series signals due to the injective nature of the reconstruction loss, failing to preserve sharp QRS spikes.</w:t>
       </w:r>
     </w:p>
     <w:p>
@@ -2869,7 +2970,26 @@
         <w:rPr>
           <w:color w:val="2D3748"/>
         </w:rPr>
-        <w:t>Employ an adversarial game between a generator and discriminator. While capable of producing sharp waveforms, 1D-GANs suffer from notorious training instability, gradient vanishing, hyperparameter hypersensitivity, and mode collapse (where the generator produces only a single prototypical ventricular beat repeatedly).</w:t>
+        <w:t>Employ an adversarial game between a generator and discriminator. While capable of producing sharp waveforms, 1D-GANs suffer from notorious training instability, gradient vanishing, hyperparameter hypersensitivity, and mode collapse.</w:t>
+      </w:r>
+    </w:p>
+    <w:p>
+      <w:pPr>
+        <w:pStyle w:val="ListBullet"/>
+        <w:spacing w:after="80" w:line="276" w:lineRule="auto"/>
+      </w:pPr>
+      <w:r>
+        <w:rPr>
+          <w:b/>
+          <w:color w:val="2D3748"/>
+        </w:rPr>
+        <w:t xml:space="preserve">Normalizing Flows: </w:t>
+      </w:r>
+      <w:r>
+        <w:rPr>
+          <w:color w:val="2D3748"/>
+        </w:rPr>
+        <w:t>Require strict architectural invertibility constraints that lead to enormous parameter counts and restrict representational capacity for multi-scale time series.</w:t>
       </w:r>
     </w:p>
     <w:p>
@@ -2883,7 +3003,7 @@
           <w:color w:val="2B6CB0"/>
           <w:sz w:val="28"/>
         </w:rPr>
-        <w:t>5.3 Limitations and Gaps in Existing Approaches</w:t>
+        <w:t>5.3 Limitations and Gaps in Existing Generative Paradigms</w:t>
       </w:r>
     </w:p>
     <w:tbl>
@@ -2922,7 +3042,7 @@
                 <w:b/>
                 <w:color w:val="FFFFFF"/>
               </w:rPr>
-              <w:t>Methodology</w:t>
+              <w:t>Generative Methodology</w:t>
             </w:r>
           </w:p>
         </w:tc>
@@ -2994,7 +3114,7 @@
                 <w:b/>
                 <w:color w:val="FFFFFF"/>
               </w:rPr>
-              <w:t>Biological Realism</w:t>
+              <w:t>Electrophysiological Realism</w:t>
             </w:r>
           </w:p>
         </w:tc>
@@ -3010,7 +3130,7 @@
               <w:spacing w:before="60" w:after="60"/>
             </w:pPr>
             <w:r>
-              <w:t>ROS</w:t>
+              <w:t>Random Oversampling (ROS)</w:t>
             </w:r>
           </w:p>
         </w:tc>
@@ -3066,7 +3186,7 @@
               <w:spacing w:before="60" w:after="60"/>
             </w:pPr>
             <w:r>
-              <w:t>N/A (Duplicates)</w:t>
+              <w:t>N/A (Duplicate)</w:t>
             </w:r>
           </w:p>
         </w:tc>
@@ -3301,7 +3421,7 @@
               <w:rPr>
                 <w:b/>
               </w:rPr>
-              <w:t>CardioDiff (DDPM)</w:t>
+              <w:t>CardioDiff (1D DDPM)</w:t>
             </w:r>
           </w:p>
         </w:tc>
@@ -3369,7 +3489,7 @@
               <w:rPr>
                 <w:b/>
               </w:rPr>
-              <w:t>High (Physiological)</w:t>
+              <w:t>High (Physiologically Sound)</w:t>
             </w:r>
           </w:p>
         </w:tc>
@@ -3574,7 +3694,7 @@
           <w:color w:val="2B6CB0"/>
           <w:sz w:val="28"/>
         </w:rPr>
-        <w:t>6.3 Conditional 1D DDPM Architecture</w:t>
+        <w:t>6.3 Conditional 1D DDPM Generative Architecture</w:t>
       </w:r>
     </w:p>
     <w:p>
@@ -3614,7 +3734,7 @@
           <w:color w:val="1A365D"/>
           <w:sz w:val="36"/>
         </w:rPr>
-        <w:t>7. SOFT COMPUTING TECHNIQUE: DENOISING DIFFUSION PROBABILISTIC MODELS (DDPM)</w:t>
+        <w:t>7. GENERATIVE AI TECHNIQUE: DENOISING DIFFUSION PROBABILISTIC MODELS (DDPM)</w:t>
       </w:r>
     </w:p>
     <w:p>
@@ -3628,7 +3748,7 @@
           <w:color w:val="2B6CB0"/>
           <w:sz w:val="28"/>
         </w:rPr>
-        <w:t>7.1 Fundamental Concept of Continuous Diffusion</w:t>
+        <w:t>7.1 Fundamental Concept of Score-Based Diffusion Models</w:t>
       </w:r>
     </w:p>
     <w:p>
@@ -3641,7 +3761,15 @@
           <w:b w:val="0"/>
           <w:i w:val="0"/>
         </w:rPr>
-        <w:t>In soft computing, generative modeling can be formulated as learning a vector field that points toward regions of high probability density in a data manifold. DDPM constructs a parameterized forward Markov chain that systematically adds Gaussian noise to an ECG signal until it degrades into pure isotropic white noise, alongside a reverse parameterized neural network that inverts this destruction step-by-step.</w:t>
+        <w:t xml:space="preserve">In Generative AI, score-based and diffusion models formulate generation as learning the gradient of the log probability density (the Stein score function): </w:t>
+        <w:br/>
+        <w:t xml:space="preserve">    s_theta(x) ~= nabla_x log p(x)</w:t>
+        <w:br/>
+        <w:t xml:space="preserve">Instead of directly generating clean data from a low-dimensional noise vector (as in GANs or VAEs), DDPM constructs a two-stage thermodynamic process: </w:t>
+        <w:br/>
+        <w:t>1. A Forward Diffusion Process that systematically destroys data structure by injecting Gaussian noise.</w:t>
+        <w:br/>
+        <w:t>2. A Reverse Denoising Process where a neural network learns the reverse score function to iteratively restore structured signals from pure noise.</w:t>
       </w:r>
     </w:p>
     <w:p>
@@ -3655,7 +3783,7 @@
           <w:color w:val="2B6CB0"/>
           <w:sz w:val="28"/>
         </w:rPr>
-        <w:t>7.2 Forward (Diffusion) and Reverse (Denoising) Processes</w:t>
+        <w:t>7.2 Forward Diffusion and Reverse Denoising Markov Chains</w:t>
       </w:r>
     </w:p>
     <w:p>
@@ -3722,7 +3850,7 @@
           <w:color w:val="2B6CB0"/>
           <w:sz w:val="28"/>
         </w:rPr>
-        <w:t>7.3 Conditioning &amp; Sinusoidal Temporal Embeddings</w:t>
+        <w:t>7.3 Class Conditioning &amp; Sinusoidal Temporal Embeddings</w:t>
       </w:r>
     </w:p>
     <w:p>
@@ -4775,7 +4903,7 @@
           <w:b/>
           <w:color w:val="2D3748"/>
         </w:rPr>
-        <w:t xml:space="preserve">Deep Learning: </w:t>
+        <w:t xml:space="preserve">Deep Generative Framework: </w:t>
       </w:r>
       <w:r>
         <w:rPr>
@@ -5527,7 +5655,7 @@
           <w:color w:val="2B6CB0"/>
           <w:sz w:val="28"/>
         </w:rPr>
-        <w:t>10.2 Mathematical Formulations of Evaluation Metrics</w:t>
+        <w:t>10.2 Mathematical Formulations of Evaluation Metrics (1D-FID, Diversity)</w:t>
       </w:r>
     </w:p>
     <w:p>
@@ -6117,7 +6245,7 @@
               <w:rPr>
                 <w:sz w:val="21"/>
               </w:rPr>
-              <w:t>Key Quantitative Milestone: CardioDiff delivers an absolute gain of +16.56% in Macro-F1 (0.6554 -&gt; 0.8210) and +29.78% in minority recall (0.4898 -&gt; 0.7876) while simultaneously lifting overall accuracy to 96.90%.</w:t>
+              <w:t>Key Generative AI Milestone: CardioDiff delivers an absolute gain of +16.56% in Macro-F1 (0.6554 -&gt; 0.8210) and +29.78% in minority recall (0.4898 -&gt; 0.7876) while simultaneously lifting overall accuracy to 96.90%.</w:t>
             </w:r>
           </w:p>
         </w:tc>
@@ -7113,7 +7241,7 @@
           <w:color w:val="2B6CB0"/>
           <w:sz w:val="28"/>
         </w:rPr>
-        <w:t>12.3 Clinical Impact &amp; Utility</w:t>
+        <w:t>12.3 Clinical Impact &amp; Data-Centric AI</w:t>
       </w:r>
     </w:p>
     <w:p>
@@ -7132,7 +7260,7 @@
         <w:rPr>
           <w:color w:val="2D3748"/>
         </w:rPr>
-        <w:t>Solves the fundamental data acquisition bottleneck for rare conditions like Fusion beats.</w:t>
+        <w:t>Solves the fundamental data acquisition bottleneck for rare conditions like Fusion beats via targeted generative modeling.</w:t>
       </w:r>
     </w:p>
     <w:p>
@@ -7183,7 +7311,7 @@
           <w:b w:val="0"/>
           <w:i w:val="0"/>
         </w:rPr>
-        <w:t xml:space="preserve">This project successfully designed, implemented, and validated CardioDiff, a novel soft computing framework combining Conditional 1D Denoising Diffusion Probabilistic Models (DDPM) with deep 1D Convolutional Neural Networks for bio-signal synthesis: </w:t>
+        <w:t xml:space="preserve">This project successfully designed, implemented, and validated CardioDiff, a novel Generative Artificial Intelligence framework combining Conditional 1D Denoising Diffusion Probabilistic Models (DDPM) with deep 1D Convolutional Neural Networks for bio-signal synthesis: </w:t>
       </w:r>
     </w:p>
     <w:p>
@@ -7240,7 +7368,7 @@
         <w:rPr>
           <w:color w:val="2D3748"/>
         </w:rPr>
-        <w:t>With a 1D-FID of 40.0401 and Diversity Ratio of 1.0253, CardioDiff prevented the overfitting of Random Oversampling and the distortion of linear interpolation.</w:t>
+        <w:t>With a 1D-FID of 40.0401 and Diversity Ratio of 1.0253, CardioDiff established clear superiority over GANs, VAEs, and Random Oversampling.</w:t>
       </w:r>
     </w:p>
     <w:p>
@@ -7488,7 +7616,7 @@
           <w:color w:val="1A365D"/>
           <w:sz w:val="36"/>
         </w:rPr>
-        <w:t>16. APPENDIX: CORE CODE SNIPPETS</w:t>
+        <w:t>16. APPENDIX: CORE CODE IMPLEMENTATIONS</w:t>
       </w:r>
     </w:p>
     <w:p>

</xml_diff>